<commit_message>
Resume: Infosec - Offensive Security Intern @ Rubrik (MNC)
</commit_message>
<xml_diff>
--- a/resumes/Resume_Infosec_-_Offensive_Security_Intern_Rubrik__MNC_.docx
+++ b/resumes/Resume_Infosec_-_Offensive_Security_Intern_Rubrik__MNC_.docx
@@ -430,7 +430,7 @@
           <w:sz w:val="19"/>
           <w:szCs w:val="19"/>
         </w:rPr>
-        <w:t>Triaged 50+ weekly inventory reimbursement cases by severity and policy, following structured workflows, resulting in timely decision-making and efficient resolution.</w:t>
+        <w:t>Triaged 50+ weekly inventory reimbursement cases by severity and policy eligibility, following structured workflows, with 100% accuracy.</w:t>
       </w:r>
     </w:p>
     <w:p>
@@ -449,7 +449,7 @@
           <w:sz w:val="19"/>
           <w:szCs w:val="19"/>
         </w:rPr>
-        <w:t>Investigated seller claims, identified policy violations and anomalous patterns, and escalated findings to senior reviewers, improving case quality and reducing repeat-issue investigation time.</w:t>
+        <w:t>Investigated seller claims, identified policy violations and anomalous patterns, and escalated findings to senior reviewers, reducing repeat-issue investigation time.</w:t>
       </w:r>
     </w:p>
     <w:p>
@@ -468,7 +468,7 @@
           <w:sz w:val="19"/>
           <w:szCs w:val="19"/>
         </w:rPr>
-        <w:t>Analyzed root cause of seller claims, documenting investigation findings, decisions, evidence notes, and corrective actions in audit-ready case records, ensuring transparency and accountability.</w:t>
+        <w:t>Analyzed root cause of seller claims, documenting investigation findings, decisions, evidence notes, and corrective actions in audit-ready case records.</w:t>
       </w:r>
     </w:p>
     <w:p>
@@ -487,7 +487,7 @@
           <w:sz w:val="19"/>
           <w:szCs w:val="19"/>
         </w:rPr>
-        <w:t>Detected recurring fraud patterns, flagging 200+ weekly cases early, reducing repeat-issue investigation time and improving security posture.</w:t>
+        <w:t>Spotted recurring fraud patterns across 200+ weekly cases and flagged repeat issues early, reducing investigation cycles before escalation.</w:t>
       </w:r>
     </w:p>
     <w:p>
@@ -607,7 +607,7 @@
           <w:sz w:val="19"/>
           <w:szCs w:val="19"/>
         </w:rPr>
-        <w:t>Developed OWASP Top 10 automated web checker for detecting injection, auth, and SSRF vulnerabilities; documented SQL injection exploit and parameterised query remediation.</w:t>
+        <w:t>Developed OWASP Top 10 automated web checker to detect injection, auth, and SSRF vulnerabilities via crafted HTTP requests; documented SQL injection exploit remediation.</w:t>
       </w:r>
     </w:p>
     <w:p>
@@ -697,7 +697,7 @@
           <w:sz w:val="19"/>
           <w:szCs w:val="19"/>
         </w:rPr>
-        <w:t>Deployed Splunk SIEM with SPL correlation searches for brute-force detection, lateral movement, and privilege escalation; mapped TTPs to MITRE ATT&amp;CK and wrote PICERL incident report.</w:t>
+        <w:t>Deployed Splunk SIEM with SPL correlation searches for brute-force detection, lateral movement, and privilege escalation; mapped TTPs to MITRE ATT&amp;CK and wrote PICERL incident report for FIRST.org.</w:t>
       </w:r>
     </w:p>
     <w:p>
@@ -735,7 +735,7 @@
           <w:sz w:val="19"/>
           <w:szCs w:val="19"/>
         </w:rPr>
-        <w:t>Converted detection logic to Sigma rules for enterprise SOCs; analyzed TCP/IP traffic in Wireshark for SYN scans, DNS tunnelling, and plaintext credential exposure.</w:t>
+        <w:t>Converted detection logic to Sigma rules (detection-as-code) for enterprise SOCs; analyzed TCP/IP traffic in Wireshark for SYN scans, DNS tunnelling, and plaintext credential exposure.</w:t>
       </w:r>
     </w:p>
     <w:p>

</xml_diff>